<commit_message>
Archive Spring 2026 and harden BIOL-1 Fall 2026
</commit_message>
<xml_diff>
--- a/PUBLISHED/biol-1/ALL_FILES/Schedule.docx
+++ b/PUBLISHED/biol-1/ALL_FILES/Schedule.docx
@@ -15,7 +15,14 @@
         <w:pStyle w:val="Heading2"/>
       </w:pPr>
       <w:r>
-        <w:t>Spring 2026</w:t>
+        <w:t>Fall 2026</w:t>
+      </w:r>
+    </w:p>
+    <w:p>
+      <w:r>
+        <w:t>Draft schedule for the Fall 2026 Pelican Bay offering. Section number,</w:t>
+        <w:br/>
+        <w:t>yard/room, and official final-exam slot remain TBD.</w:t>
       </w:r>
     </w:p>
     <w:tbl>
@@ -109,7 +116,7 @@
           </w:tcPr>
           <w:p>
             <w:r>
-              <w:t>1/19</w:t>
+              <w:t>8/24</w:t>
             </w:r>
           </w:p>
         </w:tc>
@@ -119,7 +126,7 @@
           </w:tcPr>
           <w:p>
             <w:r>
-              <w:t>No Class</w:t>
+              <w:t>Module 1: Biology - The Study of Life; Module 2: Basic Chemistry</w:t>
             </w:r>
           </w:p>
         </w:tc>
@@ -129,7 +136,7 @@
           </w:tcPr>
           <w:p>
             <w:r>
-              <w:t>MLK Day Holiday</w:t>
+              <w:t>First class meeting</w:t>
             </w:r>
           </w:p>
         </w:tc>
@@ -161,7 +168,7 @@
           </w:tcPr>
           <w:p>
             <w:r>
-              <w:t>1/21</w:t>
+              <w:t>8/26</w:t>
             </w:r>
           </w:p>
         </w:tc>
@@ -171,7 +178,7 @@
           </w:tcPr>
           <w:p>
             <w:r>
-              <w:t>Module 1: Biology - The Study of Life; Module 2: Basic Chemistry</w:t>
+              <w:t>Module 3: Organic Molecules; Lab 1</w:t>
             </w:r>
           </w:p>
         </w:tc>
@@ -211,7 +218,7 @@
           </w:tcPr>
           <w:p>
             <w:r>
-              <w:t>1/26</w:t>
+              <w:t>8/31</w:t>
             </w:r>
           </w:p>
         </w:tc>
@@ -221,7 +228,7 @@
           </w:tcPr>
           <w:p>
             <w:r>
-              <w:t>Module 3: Organic Molecules; Lab 1</w:t>
+              <w:t>Module 4: Cells; Lab 2</w:t>
             </w:r>
           </w:p>
         </w:tc>
@@ -261,7 +268,7 @@
           </w:tcPr>
           <w:p>
             <w:r>
-              <w:t>1/28</w:t>
+              <w:t>9/2</w:t>
             </w:r>
           </w:p>
         </w:tc>
@@ -271,7 +278,7 @@
           </w:tcPr>
           <w:p>
             <w:r>
-              <w:t>Module 4: Cells; Lab 2</w:t>
+              <w:t>No Class</w:t>
             </w:r>
           </w:p>
         </w:tc>
@@ -280,7 +287,9 @@
             <w:tcW w:type="dxa" w:w="1728"/>
           </w:tcPr>
           <w:p>
-            <w:r/>
+            <w:r>
+              <w:t>First Wednesday - Programs Canceled</w:t>
+            </w:r>
           </w:p>
         </w:tc>
       </w:tr>
@@ -311,7 +320,7 @@
           </w:tcPr>
           <w:p>
             <w:r>
-              <w:t>2/2</w:t>
+              <w:t>9/7</w:t>
             </w:r>
           </w:p>
         </w:tc>
@@ -321,7 +330,7 @@
           </w:tcPr>
           <w:p>
             <w:r>
-              <w:t>Lab 3 / Practice</w:t>
+              <w:t>No Class</w:t>
             </w:r>
           </w:p>
         </w:tc>
@@ -331,7 +340,7 @@
           </w:tcPr>
           <w:p>
             <w:r>
-              <w:t>Monday class meets</w:t>
+              <w:t>Labor Day Holiday</w:t>
             </w:r>
           </w:p>
         </w:tc>
@@ -363,7 +372,7 @@
           </w:tcPr>
           <w:p>
             <w:r>
-              <w:t>2/4</w:t>
+              <w:t>9/9</w:t>
             </w:r>
           </w:p>
         </w:tc>
@@ -373,7 +382,7 @@
           </w:tcPr>
           <w:p>
             <w:r>
-              <w:t>No Class</w:t>
+              <w:t>Lab 3 / Practice</w:t>
             </w:r>
           </w:p>
         </w:tc>
@@ -382,9 +391,7 @@
             <w:tcW w:type="dxa" w:w="1728"/>
           </w:tcPr>
           <w:p>
-            <w:r>
-              <w:t>First Wednesday - Programs Canceled</w:t>
-            </w:r>
+            <w:r/>
           </w:p>
         </w:tc>
       </w:tr>
@@ -415,7 +422,7 @@
           </w:tcPr>
           <w:p>
             <w:r>
-              <w:t>2/9</w:t>
+              <w:t>9/14</w:t>
             </w:r>
           </w:p>
         </w:tc>
@@ -425,7 +432,7 @@
           </w:tcPr>
           <w:p>
             <w:r>
-              <w:t>Practice Test 1 (Modules 1-4)</w:t>
+              <w:t>Practice Test 01 (Modules 1-4)</w:t>
             </w:r>
           </w:p>
         </w:tc>
@@ -467,7 +474,7 @@
           </w:tcPr>
           <w:p>
             <w:r>
-              <w:t>2/11</w:t>
+              <w:t>9/16</w:t>
             </w:r>
           </w:p>
         </w:tc>
@@ -517,7 +524,7 @@
           </w:tcPr>
           <w:p>
             <w:r>
-              <w:t>2/16</w:t>
+              <w:t>9/21</w:t>
             </w:r>
           </w:p>
         </w:tc>
@@ -527,7 +534,7 @@
           </w:tcPr>
           <w:p>
             <w:r>
-              <w:t>No Class</w:t>
+              <w:t>Module 6: Metabolism; Lab 5: Viewing Life</w:t>
             </w:r>
           </w:p>
         </w:tc>
@@ -536,9 +543,7 @@
             <w:tcW w:type="dxa" w:w="1728"/>
           </w:tcPr>
           <w:p>
-            <w:r>
-              <w:t>Presidents' Day Holiday</w:t>
-            </w:r>
+            <w:r/>
           </w:p>
         </w:tc>
       </w:tr>
@@ -569,7 +574,7 @@
           </w:tcPr>
           <w:p>
             <w:r>
-              <w:t>2/18</w:t>
+              <w:t>9/23</w:t>
             </w:r>
           </w:p>
         </w:tc>
@@ -579,7 +584,7 @@
           </w:tcPr>
           <w:p>
             <w:r>
-              <w:t>Module 6: Metabolism; Lab 5: Viewing Life</w:t>
+              <w:t>Practice Test 02 (Modules 5-6) / Exam 01 Review (Modules 1-6); Lab 6: Exam Review (Paper-based)</w:t>
             </w:r>
           </w:p>
         </w:tc>
@@ -619,57 +624,7 @@
           </w:tcPr>
           <w:p>
             <w:r>
-              <w:t>2/23</w:t>
-            </w:r>
-          </w:p>
-        </w:tc>
-        <w:tc>
-          <w:tcPr>
-            <w:tcW w:type="dxa" w:w="1728"/>
-          </w:tcPr>
-          <w:p>
-            <w:r>
-              <w:t>Exam 01 Review (Modules 1-6); Lab 6: Exam Review (Paper-based)</w:t>
-            </w:r>
-          </w:p>
-        </w:tc>
-        <w:tc>
-          <w:tcPr>
-            <w:tcW w:type="dxa" w:w="1728"/>
-          </w:tcPr>
-          <w:p>
-            <w:r/>
-          </w:p>
-        </w:tc>
-      </w:tr>
-      <w:tr>
-        <w:tc>
-          <w:tcPr>
-            <w:tcW w:type="dxa" w:w="1728"/>
-          </w:tcPr>
-          <w:p>
-            <w:r>
-              <w:t>6</w:t>
-            </w:r>
-          </w:p>
-        </w:tc>
-        <w:tc>
-          <w:tcPr>
-            <w:tcW w:type="dxa" w:w="1728"/>
-          </w:tcPr>
-          <w:p>
-            <w:r>
-              <w:t>Wed</w:t>
-            </w:r>
-          </w:p>
-        </w:tc>
-        <w:tc>
-          <w:tcPr>
-            <w:tcW w:type="dxa" w:w="1728"/>
-          </w:tcPr>
-          <w:p>
-            <w:r>
-              <w:t>2/25</w:t>
+              <w:t>9/28</w:t>
             </w:r>
           </w:p>
         </w:tc>
@@ -701,6 +656,56 @@
           </w:tcPr>
           <w:p>
             <w:r>
+              <w:t>6</w:t>
+            </w:r>
+          </w:p>
+        </w:tc>
+        <w:tc>
+          <w:tcPr>
+            <w:tcW w:type="dxa" w:w="1728"/>
+          </w:tcPr>
+          <w:p>
+            <w:r>
+              <w:t>Wed</w:t>
+            </w:r>
+          </w:p>
+        </w:tc>
+        <w:tc>
+          <w:tcPr>
+            <w:tcW w:type="dxa" w:w="1728"/>
+          </w:tcPr>
+          <w:p>
+            <w:r>
+              <w:t>9/30</w:t>
+            </w:r>
+          </w:p>
+        </w:tc>
+        <w:tc>
+          <w:tcPr>
+            <w:tcW w:type="dxa" w:w="1728"/>
+          </w:tcPr>
+          <w:p>
+            <w:r>
+              <w:t>Modules 07-11 Preview</w:t>
+            </w:r>
+          </w:p>
+        </w:tc>
+        <w:tc>
+          <w:tcPr>
+            <w:tcW w:type="dxa" w:w="1728"/>
+          </w:tcPr>
+          <w:p>
+            <w:r/>
+          </w:p>
+        </w:tc>
+      </w:tr>
+      <w:tr>
+        <w:tc>
+          <w:tcPr>
+            <w:tcW w:type="dxa" w:w="1728"/>
+          </w:tcPr>
+          <w:p>
+            <w:r>
               <w:t>7</w:t>
             </w:r>
           </w:p>
@@ -721,7 +726,7 @@
           </w:tcPr>
           <w:p>
             <w:r>
-              <w:t>3/2</w:t>
+              <w:t>10/5</w:t>
             </w:r>
           </w:p>
         </w:tc>
@@ -731,7 +736,7 @@
           </w:tcPr>
           <w:p>
             <w:r>
-              <w:t>Module 7-11 Preview</w:t>
+              <w:t>Module 07: Molecular Genetics; Lab 07: Molecular Genetics</w:t>
             </w:r>
           </w:p>
         </w:tc>
@@ -740,9 +745,7 @@
             <w:tcW w:type="dxa" w:w="1728"/>
           </w:tcPr>
           <w:p>
-            <w:r>
-              <w:t>Monday class meets</w:t>
-            </w:r>
+            <w:r/>
           </w:p>
         </w:tc>
       </w:tr>
@@ -773,7 +776,7 @@
           </w:tcPr>
           <w:p>
             <w:r>
-              <w:t>3/4</w:t>
+              <w:t>10/7</w:t>
             </w:r>
           </w:p>
         </w:tc>
@@ -825,7 +828,7 @@
           </w:tcPr>
           <w:p>
             <w:r>
-              <w:t>3/9</w:t>
+              <w:t>10/12</w:t>
             </w:r>
           </w:p>
         </w:tc>
@@ -835,7 +838,7 @@
           </w:tcPr>
           <w:p>
             <w:r>
-              <w:t>Module 07: Molecular Genetics; Lab 07: Molecular Genetics</w:t>
+              <w:t>Module 08: Cellular Genetics; Lab 08: Cellular Genetics</w:t>
             </w:r>
           </w:p>
         </w:tc>
@@ -875,7 +878,7 @@
           </w:tcPr>
           <w:p>
             <w:r>
-              <w:t>3/11</w:t>
+              <w:t>10/14</w:t>
             </w:r>
           </w:p>
         </w:tc>
@@ -885,7 +888,7 @@
           </w:tcPr>
           <w:p>
             <w:r>
-              <w:t>Module 08: Cellular Genetics; Lab 08: Cellular Genetics</w:t>
+              <w:t>Module 09: Inheritance Genetics; Lab 09: Inheritance Genetics</w:t>
             </w:r>
           </w:p>
         </w:tc>
@@ -925,7 +928,7 @@
           </w:tcPr>
           <w:p>
             <w:r>
-              <w:t>3/16</w:t>
+              <w:t>10/19</w:t>
             </w:r>
           </w:p>
         </w:tc>
@@ -935,7 +938,7 @@
           </w:tcPr>
           <w:p>
             <w:r>
-              <w:t>No Class</w:t>
+              <w:t>Module 10: Epigenetics; Lab 10: Epigenetics</w:t>
             </w:r>
           </w:p>
         </w:tc>
@@ -944,9 +947,7 @@
             <w:tcW w:type="dxa" w:w="1728"/>
           </w:tcPr>
           <w:p>
-            <w:r>
-              <w:t>Spring Break</w:t>
-            </w:r>
+            <w:r/>
           </w:p>
         </w:tc>
       </w:tr>
@@ -977,7 +978,7 @@
           </w:tcPr>
           <w:p>
             <w:r>
-              <w:t>3/18</w:t>
+              <w:t>10/21</w:t>
             </w:r>
           </w:p>
         </w:tc>
@@ -987,7 +988,7 @@
           </w:tcPr>
           <w:p>
             <w:r>
-              <w:t>No Class</w:t>
+              <w:t>Module 11: Genomics &amp; Biotechnology; Lab 11: Genomics &amp; Biotechnology</w:t>
             </w:r>
           </w:p>
         </w:tc>
@@ -996,9 +997,7 @@
             <w:tcW w:type="dxa" w:w="1728"/>
           </w:tcPr>
           <w:p>
-            <w:r>
-              <w:t>Spring Break</w:t>
-            </w:r>
+            <w:r/>
           </w:p>
         </w:tc>
       </w:tr>
@@ -1029,7 +1028,7 @@
           </w:tcPr>
           <w:p>
             <w:r>
-              <w:t>3/23</w:t>
+              <w:t>10/26</w:t>
             </w:r>
           </w:p>
         </w:tc>
@@ -1039,7 +1038,7 @@
           </w:tcPr>
           <w:p>
             <w:r>
-              <w:t>Module 09: Inheritance Genetics; Lab 09: Inheritance Genetics</w:t>
+              <w:t>Practice Test 03 (Modules 7-11); Lab 12: Exam 02 Review (Paper-based)</w:t>
             </w:r>
           </w:p>
         </w:tc>
@@ -1079,7 +1078,7 @@
           </w:tcPr>
           <w:p>
             <w:r>
-              <w:t>3/25</w:t>
+              <w:t>10/28</w:t>
             </w:r>
           </w:p>
         </w:tc>
@@ -1089,7 +1088,7 @@
           </w:tcPr>
           <w:p>
             <w:r>
-              <w:t>Module 10: Epigenetics; Lab 10: Epigenetics</w:t>
+              <w:t>Exam 02 (Modules 7-11)</w:t>
             </w:r>
           </w:p>
         </w:tc>
@@ -1098,7 +1097,9 @@
             <w:tcW w:type="dxa" w:w="1728"/>
           </w:tcPr>
           <w:p>
-            <w:r/>
+            <w:r>
+              <w:t>Exam</w:t>
+            </w:r>
           </w:p>
         </w:tc>
       </w:tr>
@@ -1129,7 +1130,7 @@
           </w:tcPr>
           <w:p>
             <w:r>
-              <w:t>3/30</w:t>
+              <w:t>11/2</w:t>
             </w:r>
           </w:p>
         </w:tc>
@@ -1139,7 +1140,7 @@
           </w:tcPr>
           <w:p>
             <w:r>
-              <w:t>Module 11: Genomics &amp; Biotechnology; Lab 11: Genomics &amp; Biotechnology</w:t>
+              <w:t>Module 12: Darwin and Evolution (Ch 15); Lab 13</w:t>
             </w:r>
           </w:p>
         </w:tc>
@@ -1149,7 +1150,7 @@
           </w:tcPr>
           <w:p>
             <w:r>
-              <w:t>Monday class meets</w:t>
+              <w:t>Start of new unit</w:t>
             </w:r>
           </w:p>
         </w:tc>
@@ -1181,7 +1182,7 @@
           </w:tcPr>
           <w:p>
             <w:r>
-              <w:t>4/1</w:t>
+              <w:t>11/4</w:t>
             </w:r>
           </w:p>
         </w:tc>
@@ -1233,7 +1234,7 @@
           </w:tcPr>
           <w:p>
             <w:r>
-              <w:t>4/6</w:t>
+              <w:t>11/9</w:t>
             </w:r>
           </w:p>
         </w:tc>
@@ -1243,7 +1244,7 @@
           </w:tcPr>
           <w:p>
             <w:r>
-              <w:t>Module 7-11 Review; Lab 12: Exam 02 Review (Paper-based)</w:t>
+              <w:t>Module 13: How Populations Evolve (Ch 16); Lab 14</w:t>
             </w:r>
           </w:p>
         </w:tc>
@@ -1283,7 +1284,7 @@
           </w:tcPr>
           <w:p>
             <w:r>
-              <w:t>4/8</w:t>
+              <w:t>11/11</w:t>
             </w:r>
           </w:p>
         </w:tc>
@@ -1293,7 +1294,7 @@
           </w:tcPr>
           <w:p>
             <w:r>
-              <w:t>Exam 02 (Modules 7-11)</w:t>
+              <w:t>No Class</w:t>
             </w:r>
           </w:p>
         </w:tc>
@@ -1303,7 +1304,7 @@
           </w:tcPr>
           <w:p>
             <w:r>
-              <w:t>Exam</w:t>
+              <w:t>Veterans Day Holiday</w:t>
             </w:r>
           </w:p>
         </w:tc>
@@ -1335,7 +1336,7 @@
           </w:tcPr>
           <w:p>
             <w:r>
-              <w:t>4/13</w:t>
+              <w:t>11/16</w:t>
             </w:r>
           </w:p>
         </w:tc>
@@ -1345,7 +1346,7 @@
           </w:tcPr>
           <w:p>
             <w:r>
-              <w:t>Module 12: Darwin and Evolution (Ch 15); Lab 13</w:t>
+              <w:t>Module 14: Macroevolution (Ch 17); Lab 15</w:t>
             </w:r>
           </w:p>
         </w:tc>
@@ -1354,9 +1355,7 @@
             <w:tcW w:type="dxa" w:w="1728"/>
           </w:tcPr>
           <w:p>
-            <w:r>
-              <w:t>Start of new unit</w:t>
-            </w:r>
+            <w:r/>
           </w:p>
         </w:tc>
       </w:tr>
@@ -1387,7 +1386,7 @@
           </w:tcPr>
           <w:p>
             <w:r>
-              <w:t>4/15</w:t>
+              <w:t>11/18</w:t>
             </w:r>
           </w:p>
         </w:tc>
@@ -1397,7 +1396,7 @@
           </w:tcPr>
           <w:p>
             <w:r>
-              <w:t>Module 13: How Populations Evolve (Ch 16); Lab 14</w:t>
+              <w:t>Module 15: Population and Systems Ecology (Ch 44 &amp; 45); Lab 16</w:t>
             </w:r>
           </w:p>
         </w:tc>
@@ -1437,7 +1436,7 @@
           </w:tcPr>
           <w:p>
             <w:r>
-              <w:t>4/20</w:t>
+              <w:t>11/23</w:t>
             </w:r>
           </w:p>
         </w:tc>
@@ -1456,7 +1455,9 @@
             <w:tcW w:type="dxa" w:w="1728"/>
           </w:tcPr>
           <w:p>
-            <w:r/>
+            <w:r>
+              <w:t>Fall Break</w:t>
+            </w:r>
           </w:p>
         </w:tc>
       </w:tr>
@@ -1487,7 +1488,7 @@
           </w:tcPr>
           <w:p>
             <w:r>
-              <w:t>4/22</w:t>
+              <w:t>11/25</w:t>
             </w:r>
           </w:p>
         </w:tc>
@@ -1497,7 +1498,7 @@
           </w:tcPr>
           <w:p>
             <w:r>
-              <w:t>Module 14: Macroevolution (Ch 17); Lab 15</w:t>
+              <w:t>No Class</w:t>
             </w:r>
           </w:p>
         </w:tc>
@@ -1506,7 +1507,9 @@
             <w:tcW w:type="dxa" w:w="1728"/>
           </w:tcPr>
           <w:p>
-            <w:r/>
+            <w:r>
+              <w:t>Thanksgiving Holiday</w:t>
+            </w:r>
           </w:p>
         </w:tc>
       </w:tr>
@@ -1537,7 +1540,7 @@
           </w:tcPr>
           <w:p>
             <w:r>
-              <w:t>4/27</w:t>
+              <w:t>11/30</w:t>
             </w:r>
           </w:p>
         </w:tc>
@@ -1547,7 +1550,7 @@
           </w:tcPr>
           <w:p>
             <w:r>
-              <w:t>Module 15: Population and Systems Ecology (Ch 44 &amp; 45); Lab 16</w:t>
+              <w:t>Practice Test 04 (Modules 12-15); Lab 17: Exam 03 Review</w:t>
             </w:r>
           </w:p>
         </w:tc>
@@ -1587,7 +1590,7 @@
           </w:tcPr>
           <w:p>
             <w:r>
-              <w:t>4/29</w:t>
+              <w:t>12/2</w:t>
             </w:r>
           </w:p>
         </w:tc>
@@ -1597,7 +1600,7 @@
           </w:tcPr>
           <w:p>
             <w:r>
-              <w:t>Exam 03 Review (Modules 12-15); Lab 17</w:t>
+              <w:t>No Class</w:t>
             </w:r>
           </w:p>
         </w:tc>
@@ -1606,7 +1609,9 @@
             <w:tcW w:type="dxa" w:w="1728"/>
           </w:tcPr>
           <w:p>
-            <w:r/>
+            <w:r>
+              <w:t>First Wednesday - Programs Canceled</w:t>
+            </w:r>
           </w:p>
         </w:tc>
       </w:tr>
@@ -1637,7 +1642,7 @@
           </w:tcPr>
           <w:p>
             <w:r>
-              <w:t>5/4</w:t>
+              <w:t>12/7</w:t>
             </w:r>
           </w:p>
         </w:tc>
@@ -1689,59 +1694,7 @@
           </w:tcPr>
           <w:p>
             <w:r>
-              <w:t>5/6</w:t>
-            </w:r>
-          </w:p>
-        </w:tc>
-        <w:tc>
-          <w:tcPr>
-            <w:tcW w:type="dxa" w:w="1728"/>
-          </w:tcPr>
-          <w:p>
-            <w:r>
-              <w:t>No Class</w:t>
-            </w:r>
-          </w:p>
-        </w:tc>
-        <w:tc>
-          <w:tcPr>
-            <w:tcW w:type="dxa" w:w="1728"/>
-          </w:tcPr>
-          <w:p>
-            <w:r>
-              <w:t>First Wednesday - Programs Canceled</w:t>
-            </w:r>
-          </w:p>
-        </w:tc>
-      </w:tr>
-      <w:tr>
-        <w:tc>
-          <w:tcPr>
-            <w:tcW w:type="dxa" w:w="1728"/>
-          </w:tcPr>
-          <w:p>
-            <w:r>
-              <w:t>17</w:t>
-            </w:r>
-          </w:p>
-        </w:tc>
-        <w:tc>
-          <w:tcPr>
-            <w:tcW w:type="dxa" w:w="1728"/>
-          </w:tcPr>
-          <w:p>
-            <w:r>
-              <w:t>Mon</w:t>
-            </w:r>
-          </w:p>
-        </w:tc>
-        <w:tc>
-          <w:tcPr>
-            <w:tcW w:type="dxa" w:w="1728"/>
-          </w:tcPr>
-          <w:p>
-            <w:r>
-              <w:t>5/11</w:t>
+              <w:t>12/9</w:t>
             </w:r>
           </w:p>
         </w:tc>
@@ -1781,6 +1734,58 @@
           </w:tcPr>
           <w:p>
             <w:r>
+              <w:t>Mon</w:t>
+            </w:r>
+          </w:p>
+        </w:tc>
+        <w:tc>
+          <w:tcPr>
+            <w:tcW w:type="dxa" w:w="1728"/>
+          </w:tcPr>
+          <w:p>
+            <w:r>
+              <w:t>12/14</w:t>
+            </w:r>
+          </w:p>
+        </w:tc>
+        <w:tc>
+          <w:tcPr>
+            <w:tcW w:type="dxa" w:w="1728"/>
+          </w:tcPr>
+          <w:p>
+            <w:r>
+              <w:t>Practice Test 05 (Modules 1-15); final prep and make-up work</w:t>
+            </w:r>
+          </w:p>
+        </w:tc>
+        <w:tc>
+          <w:tcPr>
+            <w:tcW w:type="dxa" w:w="1728"/>
+          </w:tcPr>
+          <w:p>
+            <w:r>
+              <w:t>Finals week</w:t>
+            </w:r>
+          </w:p>
+        </w:tc>
+      </w:tr>
+      <w:tr>
+        <w:tc>
+          <w:tcPr>
+            <w:tcW w:type="dxa" w:w="1728"/>
+          </w:tcPr>
+          <w:p>
+            <w:r>
+              <w:t>17</w:t>
+            </w:r>
+          </w:p>
+        </w:tc>
+        <w:tc>
+          <w:tcPr>
+            <w:tcW w:type="dxa" w:w="1728"/>
+          </w:tcPr>
+          <w:p>
+            <w:r>
               <w:t>Wed</w:t>
             </w:r>
           </w:p>
@@ -1791,7 +1796,7 @@
           </w:tcPr>
           <w:p>
             <w:r>
-              <w:t>5/13</w:t>
+              <w:t>12/16</w:t>
             </w:r>
           </w:p>
         </w:tc>
@@ -1801,7 +1806,7 @@
           </w:tcPr>
           <w:p>
             <w:r>
-              <w:t>Final Exam (Exam 04)</w:t>
+              <w:t>Comprehensive Final Exam</w:t>
             </w:r>
           </w:p>
         </w:tc>
@@ -1811,7 +1816,7 @@
           </w:tcPr>
           <w:p>
             <w:r>
-              <w:t>Broad final exam</w:t>
+              <w:t>Broad final exam; official slot TBD</w:t>
             </w:r>
           </w:p>
         </w:tc>
@@ -1836,7 +1841,7 @@
         <w:t>Classes Begin</w:t>
       </w:r>
       <w:r>
-        <w:t>: January 17, 2026</w:t>
+        <w:t>: August 22, 2026</w:t>
       </w:r>
     </w:p>
     <w:p>
@@ -1847,10 +1852,66 @@
         <w:rPr>
           <w:b/>
         </w:rPr>
-        <w:t>Spring Break</w:t>
+        <w:t>Labor Day Holiday</w:t>
       </w:r>
       <w:r>
-        <w:t>: March 16-21, 2026 (No Classes)</w:t>
+        <w:t>: September 7, 2026</w:t>
+      </w:r>
+    </w:p>
+    <w:p>
+      <w:r>
+        <w:t xml:space="preserve">• </w:t>
+      </w:r>
+      <w:r>
+        <w:rPr>
+          <w:b/>
+        </w:rPr>
+        <w:t>Census Day</w:t>
+      </w:r>
+      <w:r>
+        <w:t>: September 8, 2026</w:t>
+      </w:r>
+    </w:p>
+    <w:p>
+      <w:r>
+        <w:t xml:space="preserve">• </w:t>
+      </w:r>
+      <w:r>
+        <w:rPr>
+          <w:b/>
+        </w:rPr>
+        <w:t>Veterans Day Holiday</w:t>
+      </w:r>
+      <w:r>
+        <w:t>: November 11, 2026</w:t>
+      </w:r>
+    </w:p>
+    <w:p>
+      <w:r>
+        <w:t xml:space="preserve">• </w:t>
+      </w:r>
+      <w:r>
+        <w:rPr>
+          <w:b/>
+        </w:rPr>
+        <w:t>Fall Break</w:t>
+      </w:r>
+      <w:r>
+        <w:t>: November 23-24, 2026</w:t>
+      </w:r>
+    </w:p>
+    <w:p>
+      <w:r>
+        <w:t xml:space="preserve">• </w:t>
+      </w:r>
+      <w:r>
+        <w:rPr>
+          <w:b/>
+        </w:rPr>
+        <w:t>Thanksgiving Holidays</w:t>
+      </w:r>
+      <w:r>
+        <w:t>: November 25-27, 2026</w:t>
       </w:r>
     </w:p>
     <w:p>
@@ -1864,7 +1925,7 @@
         <w:t>Final Examinations</w:t>
       </w:r>
       <w:r>
-        <w:t>: May 13, 2026</w:t>
+        <w:t>: December 12-18, 2026</w:t>
       </w:r>
     </w:p>
     <w:p>
@@ -1875,10 +1936,10 @@
         <w:rPr>
           <w:b/>
         </w:rPr>
-        <w:t>Semester Ends</w:t>
+        <w:t>Classes End</w:t>
       </w:r>
       <w:r>
-        <w:t>: May 15, 2026</w:t>
+        <w:t>: December 18, 2026</w:t>
       </w:r>
     </w:p>
     <w:p>
@@ -1892,7 +1953,7 @@
         <w:t>Programs Canceled (First Wednesday)</w:t>
       </w:r>
       <w:r>
-        <w:t>: February 4, March 4, April 1, May 6, 2026</w:t>
+        <w:t>: September 2, October 7, November 4, December 2, 2026</w:t>
       </w:r>
     </w:p>
     <w:p>
@@ -1914,7 +1975,7 @@
         <w:t>Exam 01</w:t>
       </w:r>
       <w:r>
-        <w:t>: Week 6 (February 25, 2026) - Modules 1-6</w:t>
+        <w:t>: Week 6 (September 28, 2026) - Modules 1-6</w:t>
       </w:r>
     </w:p>
     <w:p>
@@ -1928,7 +1989,7 @@
         <w:t>Exam 02</w:t>
       </w:r>
       <w:r>
-        <w:t>: Week 12 (April 8, 2026) - Modules 7-11</w:t>
+        <w:t>: Week 10 (October 28, 2026) - Modules 7-11</w:t>
       </w:r>
     </w:p>
     <w:p>
@@ -1942,7 +2003,7 @@
         <w:t>Exam 03</w:t>
       </w:r>
       <w:r>
-        <w:t>: Week 16 (May 4, 2026) - Modules 12-15</w:t>
+        <w:t>: Week 16 (December 7, 2026) - Modules 12-15</w:t>
       </w:r>
     </w:p>
     <w:p>
@@ -1953,10 +2014,31 @@
         <w:rPr>
           <w:b/>
         </w:rPr>
-        <w:t>Exam 04</w:t>
+        <w:t>Comprehensive Final Exam</w:t>
       </w:r>
       <w:r>
-        <w:t>: Week 17 (May 13, 2026) - Final Exam (Comprehensive)</w:t>
+        <w:t>: Week 17 (December 16, 2026) - official slot TBD</w:t>
+      </w:r>
+    </w:p>
+    <w:p>
+      <w:pPr>
+        <w:pStyle w:val="Heading2"/>
+      </w:pPr>
+      <w:r>
+        <w:t>Calendar Source</w:t>
+      </w:r>
+    </w:p>
+    <w:p>
+      <w:r>
+        <w:t>Fall 2026 term anchors are from the College of the Redwoods 2026-2027 Academic</w:t>
+        <w:br/>
+        <w:t xml:space="preserve">Calendar: </w:t>
+      </w:r>
+      <w:r>
+        <w:t>https://www.redwoods.edu/academics/documents/AcademicCalendar_2026-2027_DIGITAL.pdf</w:t>
+      </w:r>
+      <w:r>
+        <w:t>.</w:t>
       </w:r>
     </w:p>
     <w:sectPr>

</xml_diff>